<commit_message>
Natalidad: documentos al día con la v25 (comparativa sin reprocesos ni gestión económica)
Co-Authored-By: Claude Opus 5.5 <noreply@anthropic.com>
Claude-Session: https://claude.ai/code/session_012PCcGQXYr4PR8xb2pBrhox
</commit_message>
<xml_diff>
--- a/mockups/Documento_funcional_Natalidad.docx
+++ b/mockups/Documento_funcional_Natalidad.docx
@@ -277,7 +277,7 @@
                 <w:sz w:val="18"/>
                 <w:szCs w:val="18"/>
               </w:rPr>
-              <w:t xml:space="preserve">Versión 24 (MockupNatalidad_v24.html)</w:t>
+              <w:t xml:space="preserve">Versión 25 (MockupNatalidad_v25.html)</w:t>
             </w:r>
           </w:p>
         </w:tc>
@@ -1933,7 +1933,7 @@
                 <w:sz w:val="18"/>
                 <w:szCs w:val="18"/>
               </w:rPr>
-              <w:t xml:space="preserve">Hay que confirmar que Celonis puede calcular la cabecera para dos periodos a la vez, como en el mockup.</w:t>
+              <w:t xml:space="preserve">Hay que confirmar que Celonis puede calcular la cabecera para dos periodos a la vez, como en el mockup. De momento, sin reprocesos ni gestión económica.</w:t>
             </w:r>
           </w:p>
         </w:tc>
@@ -9495,7 +9495,7 @@
       <w:r>
         <w:drawing>
           <wp:inline distT="0" distB="0" distL="0" distR="0">
-            <wp:extent cx="6124575" cy="1628775"/>
+            <wp:extent cx="6124575" cy="1562100"/>
             <wp:effectExtent t="0" r="0" b="0" l="0"/>
             <wp:docPr id="1" name="captura" descr="Captura del mockup" title="Captura del mockup"/>
             <wp:cNvGraphicFramePr>
@@ -9520,7 +9520,7 @@
                   <pic:spPr bwMode="auto">
                     <a:xfrm>
                       <a:off x="0" y="0"/>
-                      <a:ext cx="6124575" cy="1628775"/>
+                      <a:ext cx="6124575" cy="1562100"/>
                     </a:xfrm>
                     <a:prstGeom prst="rect">
                       <a:avLst/>
@@ -9546,7 +9546,69 @@
           <w:sz w:val="17"/>
           <w:szCs w:val="17"/>
         </w:rPr>
-        <w:t xml:space="preserve">Cabecera comparada con las mismas fechas del año anterior.</w:t>
+        <w:t xml:space="preserve">Cabecera comparada con las mismas fechas del año anterior. Reprocesos y gestión económica no se comparan.</w:t>
+      </w:r>
+    </w:p>
+    <w:p>
+      <w:pPr>
+        <w:keepNext/>
+        <w:spacing w:after="60"/>
+      </w:pPr>
+      <w:r>
+        <w:drawing>
+          <wp:inline distT="0" distB="0" distL="0" distR="0">
+            <wp:extent cx="6124575" cy="3581400"/>
+            <wp:effectExtent t="0" r="0" b="0" l="0"/>
+            <wp:docPr id="1" name="captura" descr="Captura del mockup" title="Captura del mockup"/>
+            <wp:cNvGraphicFramePr>
+              <a:graphicFrameLocks xmlns:a="http://schemas.openxmlformats.org/drawingml/2006/main" noChangeAspect="1"/>
+            </wp:cNvGraphicFramePr>
+            <a:graphic xmlns:a="http://schemas.openxmlformats.org/drawingml/2006/main">
+              <a:graphicData uri="http://schemas.openxmlformats.org/drawingml/2006/picture">
+                <pic:pic xmlns:pic="http://schemas.openxmlformats.org/drawingml/2006/picture">
+                  <pic:nvPicPr>
+                    <pic:cNvPr id="0" name="" descr=""/>
+                    <pic:cNvPicPr>
+                      <a:picLocks noChangeAspect="1" noChangeArrowheads="1"/>
+                    </pic:cNvPicPr>
+                  </pic:nvPicPr>
+                  <pic:blipFill>
+                    <a:blip r:embed="rId19" cstate="none"/>
+                    <a:srcRect/>
+                    <a:stretch>
+                      <a:fillRect/>
+                    </a:stretch>
+                  </pic:blipFill>
+                  <pic:spPr bwMode="auto">
+                    <a:xfrm>
+                      <a:off x="0" y="0"/>
+                      <a:ext cx="6124575" cy="3581400"/>
+                    </a:xfrm>
+                    <a:prstGeom prst="rect">
+                      <a:avLst/>
+                    </a:prstGeom>
+                  </pic:spPr>
+                </pic:pic>
+              </a:graphicData>
+            </a:graphic>
+          </wp:inline>
+        </w:drawing>
+      </w:r>
+    </w:p>
+    <w:p>
+      <w:pPr>
+        <w:spacing w:after="220" w:before="0" w:line="276"/>
+      </w:pPr>
+      <w:r>
+        <w:rPr>
+          <w:rFonts w:ascii="Arial" w:cs="Arial" w:eastAsia="Arial" w:hAnsi="Arial"/>
+          <w:i/>
+          <w:iCs/>
+          <w:color w:val="595959"/>
+          <w:sz w:val="17"/>
+          <w:szCs w:val="17"/>
+        </w:rPr>
+        <w:t xml:space="preserve">Pestaña «Comparativa de periodos»: los dos periodos lado a lado y la actividad de cada año.</w:t>
       </w:r>
     </w:p>
     <w:p>
@@ -9596,7 +9658,23 @@
           <w:rFonts w:ascii="Arial" w:cs="Arial" w:eastAsia="Arial" w:hAnsi="Arial"/>
           <w:color w:val="0A1F44"/>
         </w:rPr>
-        <w:t xml:space="preserve">Debajo de cada indicador, la </w:t>
+        <w:t xml:space="preserve">Debajo de los indicadores de </w:t>
+      </w:r>
+      <w:r>
+        <w:rPr>
+          <w:rFonts w:ascii="Arial" w:cs="Arial" w:eastAsia="Arial" w:hAnsi="Arial"/>
+          <w:b/>
+          <w:bCs/>
+          <w:color w:val="0A1F44"/>
+        </w:rPr>
+        <w:t xml:space="preserve">volumen, tramitación y tiempos</w:t>
+      </w:r>
+      <w:r>
+        <w:rPr>
+          <w:rFonts w:ascii="Arial" w:cs="Arial" w:eastAsia="Arial" w:hAnsi="Arial"/>
+          <w:color w:val="0A1F44"/>
+        </w:rPr>
+        <w:t xml:space="preserve">, la </w:t>
       </w:r>
       <w:r>
         <w:rPr>
@@ -9645,7 +9723,33 @@
           <w:rFonts w:ascii="Arial" w:cs="Arial" w:eastAsia="Arial" w:hAnsi="Arial"/>
           <w:color w:val="0A1F44"/>
         </w:rPr>
-        <w:t xml:space="preserve">: la cabecera de los dos periodos lado a lado y la actividad por mes, trimestre, semestre o año frente al tramo anterior. Las dos tablas se exportan a Excel.</w:t>
+        <w:t xml:space="preserve">: esos indicadores en los dos periodos, lado a lado, y la actividad por mes, trimestre, semestre o año frente al tramo anterior (recibidas, dadas de alta, resueltas, favorables, denegadas o desistidas y tiempo E2E). Las dos tablas se exportan a Excel.</w:t>
+      </w:r>
+    </w:p>
+    <w:p>
+      <w:pPr>
+        <w:pStyle w:val="ListParagraph"/>
+        <w:numPr>
+          <w:ilvl w:val="0"/>
+          <w:numId w:val="2"/>
+        </w:numPr>
+        <w:spacing w:after="70" w:line="264"/>
+      </w:pPr>
+      <w:r>
+        <w:rPr>
+          <w:rFonts w:ascii="Arial" w:cs="Arial" w:eastAsia="Arial" w:hAnsi="Arial"/>
+          <w:b/>
+          <w:bCs/>
+          <w:color w:val="0A1F44"/>
+        </w:rPr>
+        <w:t xml:space="preserve">De momento no incluye reprocesos ni gestión económica</w:t>
+      </w:r>
+      <w:r>
+        <w:rPr>
+          <w:rFonts w:ascii="Arial" w:cs="Arial" w:eastAsia="Arial" w:hAnsi="Arial"/>
+          <w:color w:val="0A1F44"/>
+        </w:rPr>
+        <w:t xml:space="preserve"> (Javier, 30/10). Se podrán añadir más adelante.</w:t>
       </w:r>
     </w:p>
     <w:p>

</xml_diff>